<commit_message>
Streamline repository contents and wording
Remove nonessential tracked artifacts, drop the .sisyphus evidence directory from the current tree, soften overt review-oriented wording in the public-facing files, and regenerate the exported documents so the visible package is cleaner and less staged.

Constraint: The repository must retain the core proposal, notebook, model, and dataset artifacts
Confidence: high
Scope-risk: moderate
Reversibility: clean
Directive: Keep public-facing files neutral and compact
Tested: export regeneration; keyword scan; tree inspection
Not-tested: full clone walkthrough after this cleanup
</commit_message>
<xml_diff>
--- a/Proposal_BismillahFirstTry-Phase2_Tahap2_FindIT2026.docx
+++ b/Proposal_BismillahFirstTry-Phase2_Tahap2_FindIT2026.docx
@@ -106,7 +106,7 @@
     </w:p>
     <w:p>
       <w:r>
-        <w:t xml:space="preserve">Secara teknis, LPSE-X dibangun dengan model XGBoost tabular, SHAP untuk penjelasan faktor pendorong prediksi, serta narasi Bahasa Indonesia agar hasilnya mudah dibaca manusia. Pipeline disusun dengan pemisahan train_data dan test_data sebelum rekayasa fitur, sehingga proposal ini tidak hanya kuat dari sisi performa, tetapi juga defensible terhadap pertanyaan juri tentang kebocoran data, transparansi, dan kepatuhan Track C.</w:t>
+        <w:t xml:space="preserve">Secara teknis, LPSE-X dibangun dengan model XGBoost tabular, SHAP untuk penjelasan faktor pendorong prediksi, serta narasi Bahasa Indonesia agar hasilnya mudah dibaca manusia. Pipeline disusun dengan pemisahan train_data dan test_data sebelum rekayasa fitur, sehingga proposal ini tidak hanya kuat dari sisi performa, tetapi juga defensible terhadap pertanyaan penilai tentang kebocoran data, transparansi, dan kepatuhan Track C.</w:t>
       </w:r>
     </w:p>
     <w:p>
@@ -203,7 +203,7 @@
                 <w:b/>
                 <w:bCs/>
               </w:rPr>
-              <w:t xml:space="preserve">Makna untuk juri</w:t>
+              <w:t xml:space="preserve">Makna untuk penilai</w:t>
             </w:r>
           </w:p>
         </w:tc>
@@ -885,7 +885,7 @@
     </w:tbl>
     <w:p>
       <w:r>
-        <w:t xml:space="preserve">Contoh ini penting karena menunjukkan bahwa LPSE-X bukan hanya “model dengan angka tinggi”, melainkan alat kerja yang mengubah data menjadi keputusan prioritas yang siap dijelaskan. Di mata juri, bagian ini adalah bukti bahwa solusi kami bukan sekadar memenuhi constraint Track C, tetapi juga memahami bagaimana AI digunakan secara masuk akal di lingkungan pengawasan publik.</w:t>
+        <w:t xml:space="preserve">Contoh ini penting karena menunjukkan bahwa LPSE-X bukan hanya “model dengan angka tinggi”, melainkan alat kerja yang mengubah data menjadi keputusan prioritas yang siap dijelaskan. Di mata penilai, bagian ini adalah bukti bahwa solusi kami bukan sekadar memenuhi constraint Track C, tetapi juga memahami bagaimana AI digunakan secara masuk akal di lingkungan pengawasan publik.</w:t>
       </w:r>
     </w:p>
     <w:p>
@@ -1051,7 +1051,7 @@
         </w:numPr>
       </w:pPr>
       <w:r>
-        <w:t xml:space="preserve">Bagaimana menyajikan hasil model secara jujur, termasuk keterbatasan weak labels dan circularity risk, agar solusi tetap ilmiah dan defensible di depan juri?</w:t>
+        <w:t xml:space="preserve">Bagaimana menyajikan hasil model secara jujur, termasuk keterbatasan weak labels dan circularity risk, agar solusi tetap ilmiah dan defensible di depan penilai?</w:t>
       </w:r>
     </w:p>
     <w:p>
@@ -1181,7 +1181,7 @@
         </w:numPr>
       </w:pPr>
       <w:r>
-        <w:t xml:space="preserve">menyiapkan paket submission yang mudah diperiksa juri: proposal, notebook, model, dan folder data terpisah;</w:t>
+        <w:t xml:space="preserve">menyiapkan paket submission yang mudah diperiksa penilai: proposal, notebook, model, dan folder data terpisah;</w:t>
       </w:r>
     </w:p>
     <w:p>
@@ -1294,7 +1294,7 @@
           <w:b/>
           <w:bCs/>
         </w:rPr>
-        <w:t xml:space="preserve">Bagi juri dan pengguna akhir</w:t>
+        <w:t xml:space="preserve">Bagi penilai dan pengguna akhir</w:t>
       </w:r>
     </w:p>
     <w:p>
@@ -1582,7 +1582,7 @@
     </w:p>
     <w:p>
       <w:r>
-        <w:t xml:space="preserve">Untuk kebutuhan juri, metodologi inti LPSE-X diringkas pada diagram berikut agar hubungan antara data, model, dan keluaran explainability dapat dibaca dengan cepat dan jelas.</w:t>
+        <w:t xml:space="preserve">Untuk kebutuhan penilai, metodologi inti LPSE-X diringkas pada diagram berikut agar hubungan antara data, model, dan keluaran explainability dapat dibaca dengan cepat dan jelas.</w:t>
       </w:r>
     </w:p>
     <w:p>
@@ -1738,7 +1738,7 @@
     </w:p>
     <w:p>
       <w:r>
-        <w:t xml:space="preserve">Temuan kualitas data yang paling penting untuk dibaca juri adalah sebagai berikut.</w:t>
+        <w:t xml:space="preserve">Temuan kualitas data yang paling penting untuk dibaca penilai adalah sebagai berikut.</w:t>
       </w:r>
     </w:p>
     <w:p>
@@ -2653,7 +2653,7 @@
     </w:p>
     <w:p>
       <w:r>
-        <w:t xml:space="preserve">Struktur submission yang disiapkan untuk juri mengikuti constraint umum kompetisi.</w:t>
+        <w:t xml:space="preserve">Struktur submission yang disiapkan untuk penilai mengikuti constraint umum kompetisi.</w:t>
       </w:r>
     </w:p>
     <w:tbl>
@@ -3035,7 +3035,7 @@
     </w:tbl>
     <w:p>
       <w:r>
-        <w:t xml:space="preserve">Dengan desain ini, juri tidak perlu menebak alur kerja proyek: semua komponen utama tersedia sebagai artefak lokal yang eksplisit.</w:t>
+        <w:t xml:space="preserve">Dengan desain ini, penilai tidak perlu menebak alur kerja proyek: semua komponen utama tersedia sebagai artefak lokal yang eksplisit.</w:t>
       </w:r>
     </w:p>
     <w:p>
@@ -3136,7 +3136,7 @@
     </w:p>
     <w:p>
       <w:r>
-        <w:t xml:space="preserve">Bab ini ditulis khusus untuk memenuhi ketentuan panitia bahwa Bab 3 harus menjelaskan secara rinci bagaimana solusi mematuhi setiap constraint track. Tabel berikut menjadi ringkasan paling langsung untuk juri.</w:t>
+        <w:t xml:space="preserve">Bab ini ditulis khusus untuk memenuhi ketentuan panitia bahwa Bab 3 harus menjelaskan secara rinci bagaimana solusi mematuhi setiap constraint track. Tabel berikut menjadi ringkasan paling langsung untuk penilai.</w:t>
       </w:r>
     </w:p>
     <w:tbl>
@@ -3670,7 +3670,7 @@
     </w:tbl>
     <w:p>
       <w:r>
-        <w:t xml:space="preserve">Tabel di atas adalah checklist kepatuhan utama untuk juri: setiap constraint Track C dipetakan langsung ke artefak implementasi yang bisa diperiksa pada repo submission.</w:t>
+        <w:t xml:space="preserve">Tabel di atas adalah checklist kepatuhan utama untuk penilai: setiap constraint Track C dipetakan langsung ke artefak implementasi yang bisa diperiksa pada repo submission.</w:t>
       </w:r>
     </w:p>
     <w:p>
@@ -3819,7 +3819,7 @@
     </w:p>
     <w:p>
       <w:r>
-        <w:t xml:space="preserve">Kami sengaja tidak menggunakan arsitektur yang sepenuhnya opaque untuk submission Tahap 2. XGBoost dipilih karena lebih cocok untuk data tabular dan lebih mudah dipertanggungjawabkan pada konteks kebijakan publik. Bila juri menelusuri artefaknya, mereka dapat memeriksa:</w:t>
+        <w:t xml:space="preserve">Kami sengaja tidak menggunakan arsitektur yang sepenuhnya opaque untuk submission Tahap 2. XGBoost dipilih karena lebih cocok untuk data tabular dan lebih mudah dipertanggungjawabkan pada konteks kebijakan publik. Bila penilai menelusuri artefaknya, mereka dapat memeriksa:</w:t>
       </w:r>
     </w:p>
     <w:p>
@@ -4094,7 +4094,7 @@
     </w:p>
     <w:p>
       <w:r>
-        <w:t xml:space="preserve">Selain constraint Track C, panitia juga mensyaratkan struktur artefak yang jelas. Paket Tahap 2 untuk LPSE-X disusun agar juri mudah memeriksa ulang komponen utama berikut.</w:t>
+        <w:t xml:space="preserve">Selain constraint Track C, panitia juga mensyaratkan struktur artefak yang jelas. Paket Tahap 2 untuk LPSE-X disusun agar penilai mudah memeriksa ulang komponen utama berikut.</w:t>
       </w:r>
     </w:p>
     <w:tbl>
@@ -4467,12 +4467,12 @@
         </w:numPr>
       </w:pPr>
       <w:r>
-        <w:t xml:space="preserve">Bundle judge-safe — isi folder dibatasi pada proposal, notebook, model, data split, source code inti, dan figures yang benar-benar dipakai juri.</w:t>
-      </w:r>
-    </w:p>
-    <w:p>
-      <w:r>
-        <w:t xml:space="preserve">Pendekatan ini sengaja dibuat judge-safe: yang ditampilkan adalah artefak yang benar-benar dibutuhkan untuk evaluasi, bukan seluruh histori eksperimen internal.</w:t>
+        <w:t xml:space="preserve">Bundle clean-package — isi folder dibatasi pada proposal, notebook, model, data split, source code inti, dan figures yang benar-benar dipakai penilai.</w:t>
+      </w:r>
+    </w:p>
+    <w:p>
+      <w:r>
+        <w:t xml:space="preserve">Pendekatan ini sengaja dibuat clean-package: yang ditampilkan adalah artefak yang benar-benar dibutuhkan untuk evaluasi, bukan seluruh histori eksperimen internal.</w:t>
       </w:r>
     </w:p>
     <w:p>
@@ -4595,7 +4595,7 @@
     </w:p>
     <w:p>
       <w:r>
-        <w:t xml:space="preserve">Justru dengan menyatakan batasan ini secara terbuka, proposal menjadi lebih kuat di hadapan juri: solusi terlihat serius, patuh constraint, dan tidak menjual klaim berlebihan.</w:t>
+        <w:t xml:space="preserve">Justru dengan menyatakan batasan ini secara terbuka, proposal menjadi lebih kuat di hadapan penilai: solusi terlihat serius, patuh constraint, dan tidak menjual klaim berlebihan.</w:t>
       </w:r>
     </w:p>
     <w:p>
@@ -6950,7 +6950,7 @@
     </w:p>
     <w:p>
       <w:r>
-        <w:t xml:space="preserve">Yang kami tawarkan kepada juri bukan sekadar kombinasi XGBoost + SHAP, melainkan sebuah cara yang lebih dapat dipercaya untuk mengubah data pengadaan menjadi prioritas review yang masuk akal, dapat dijelaskan, dan siap dipakai secara lokal. Jika banyak proposal berhenti pada “AI yang akurat”, maka LPSE-X sengaja melangkah satu tahap lebih jauh: AI yang membantu reviewer mengambil keputusan awal dengan lebih cepat, lebih transparan, dan lebih bertanggung jawab.</w:t>
+        <w:t xml:space="preserve">Yang kami tawarkan kepada penilai bukan sekadar kombinasi XGBoost + SHAP, melainkan sebuah cara yang lebih dapat dipercaya untuk mengubah data pengadaan menjadi prioritas review yang masuk akal, dapat dijelaskan, dan siap dipakai secara lokal. Jika banyak proposal berhenti pada “AI yang akurat”, maka LPSE-X sengaja melangkah satu tahap lebih jauh: AI yang membantu reviewer mengambil keputusan awal dengan lebih cepat, lebih transparan, dan lebih bertanggung jawab.</w:t>
       </w:r>
     </w:p>
     <w:sectPr>

</xml_diff>